<commit_message>
Added submission for V01
finished and submitted exercise V01
</commit_message>
<xml_diff>
--- a/Praktikum/V01/Bericht_Praktikum_mINF4-1_V01.docx
+++ b/Praktikum/V01/Bericht_Praktikum_mINF4-1_V01.docx
@@ -4,15 +4,26 @@
   <w:body>
     <w:p>
       <w:pPr>
-        <w:pStyle w:val="berschrift1"/>
-      </w:pPr>
-      <w:r>
-        <w:t>Praktikum 1</w:t>
+        <w:pStyle w:val="Titel"/>
+      </w:pPr>
+      <w:r>
+        <w:t>Praktikumsbericht zu Versuch 1</w:t>
       </w:r>
     </w:p>
     <w:p>
       <w:pPr>
-        <w:pStyle w:val="berschrift2"/>
+        <w:pStyle w:val="Untertitel"/>
+      </w:pPr>
+      <w:r>
+        <w:t xml:space="preserve">Von </w:t>
+      </w:r>
+      <w:r>
+        <w:t>Daniel Baer (3235621)</w:t>
+      </w:r>
+    </w:p>
+    <w:p>
+      <w:pPr>
+        <w:pStyle w:val="berschrift1"/>
       </w:pPr>
       <w:r>
         <w:t>Komplexität ablesen</w:t>
@@ -135,25 +146,7 @@
           <w:rPr>
             <w:rFonts w:ascii="Cambria Math" w:hAnsi="Cambria Math"/>
           </w:rPr>
-          <m:t>O</m:t>
-        </m:r>
-        <m:r>
-          <w:rPr>
-            <w:rFonts w:ascii="Cambria Math" w:hAnsi="Cambria Math"/>
-          </w:rPr>
-          <m:t>(</m:t>
-        </m:r>
-        <m:r>
-          <w:rPr>
-            <w:rFonts w:ascii="Cambria Math" w:hAnsi="Cambria Math"/>
-          </w:rPr>
-          <m:t>n!</m:t>
-        </m:r>
-        <m:r>
-          <w:rPr>
-            <w:rFonts w:ascii="Cambria Math" w:hAnsi="Cambria Math"/>
-          </w:rPr>
-          <m:t>)</m:t>
+          <m:t>O(n!)</m:t>
         </m:r>
       </m:oMath>
       <w:r>
@@ -218,7 +211,7 @@
     </w:p>
     <w:p>
       <w:pPr>
-        <w:pStyle w:val="berschrift2"/>
+        <w:pStyle w:val="berschrift1"/>
       </w:pPr>
       <w:r>
         <w:t>Maximale Abschnittssumme</w:t>
@@ -300,13 +293,7 @@
           <w:rPr>
             <w:rFonts w:ascii="Cambria Math" w:eastAsiaTheme="minorEastAsia" w:hAnsi="Cambria Math"/>
           </w:rPr>
-          <m:t>O</m:t>
-        </m:r>
-        <m:r>
-          <w:rPr>
-            <w:rFonts w:ascii="Cambria Math" w:eastAsiaTheme="minorEastAsia" w:hAnsi="Cambria Math"/>
-          </w:rPr>
-          <m:t>(n ld(n))</m:t>
+          <m:t>O(n ld(n))</m:t>
         </m:r>
       </m:oMath>
       <w:r>
@@ -336,7 +323,7 @@
     </w:p>
     <w:p>
       <w:pPr>
-        <w:pStyle w:val="berschrift2"/>
+        <w:pStyle w:val="berschrift1"/>
       </w:pPr>
       <w:r>
         <w:t>O-Notation formal anwenden</w:t>
@@ -452,13 +439,7 @@
           <w:rPr>
             <w:rFonts w:ascii="Cambria Math" w:hAnsi="Cambria Math"/>
           </w:rPr>
-          <m:t>≤c∙g(n</m:t>
-        </m:r>
-        <m:r>
-          <w:rPr>
-            <w:rFonts w:ascii="Cambria Math" w:hAnsi="Cambria Math"/>
-          </w:rPr>
-          <m:t>)</m:t>
+          <m:t>≤c∙g(n)</m:t>
         </m:r>
       </m:oMath>
     </w:p>
@@ -547,6 +528,9 @@
             </m:e>
           </m:d>
           <m:r>
+            <m:rPr>
+              <m:sty m:val="p"/>
+            </m:rPr>
             <w:rPr>
               <w:rFonts w:eastAsiaTheme="minorEastAsia"/>
             </w:rPr>
@@ -561,6 +545,9 @@
             <m:t>4n+7 ≤11∙n</m:t>
           </m:r>
           <m:r>
+            <m:rPr>
+              <m:sty m:val="p"/>
+            </m:rPr>
             <w:rPr>
               <w:rFonts w:ascii="Cambria Math" w:eastAsiaTheme="minorEastAsia" w:hAnsi="Cambria Math"/>
             </w:rPr>
@@ -582,6 +569,9 @@
           <m:t>n≥1</m:t>
         </m:r>
         <m:r>
+          <m:rPr>
+            <m:sty m:val="p"/>
+          </m:rPr>
           <w:rPr>
             <w:rFonts w:ascii="Cambria Math" w:eastAsiaTheme="minorEastAsia" w:hAnsi="Cambria Math"/>
           </w:rPr>
@@ -659,37 +649,7 @@
           <w:rPr>
             <w:rFonts w:ascii="Cambria Math" w:hAnsi="Cambria Math"/>
           </w:rPr>
-          <m:t>c=</m:t>
-        </m:r>
-        <m:r>
-          <w:rPr>
-            <w:rFonts w:ascii="Cambria Math" w:hAnsi="Cambria Math"/>
-          </w:rPr>
-          <m:t>3</m:t>
-        </m:r>
-        <m:r>
-          <w:rPr>
-            <w:rFonts w:ascii="Cambria Math" w:hAnsi="Cambria Math"/>
-          </w:rPr>
-          <m:t>+</m:t>
-        </m:r>
-        <m:r>
-          <w:rPr>
-            <w:rFonts w:ascii="Cambria Math" w:hAnsi="Cambria Math"/>
-          </w:rPr>
-          <m:t>10+5</m:t>
-        </m:r>
-        <m:r>
-          <w:rPr>
-            <w:rFonts w:ascii="Cambria Math" w:hAnsi="Cambria Math"/>
-          </w:rPr>
-          <m:t>=</m:t>
-        </m:r>
-        <m:r>
-          <w:rPr>
-            <w:rFonts w:ascii="Cambria Math" w:hAnsi="Cambria Math"/>
-          </w:rPr>
-          <m:t>18</m:t>
+          <m:t>c=3+10+5=18</m:t>
         </m:r>
       </m:oMath>
       <w:r>
@@ -752,6 +712,9 @@
             </m:e>
           </m:d>
           <m:r>
+            <m:rPr>
+              <m:sty m:val="p"/>
+            </m:rPr>
             <w:rPr>
               <w:rFonts w:eastAsiaTheme="minorEastAsia"/>
             </w:rPr>
@@ -795,31 +758,7 @@
             <w:rPr>
               <w:rFonts w:ascii="Cambria Math" w:eastAsiaTheme="minorEastAsia" w:hAnsi="Cambria Math"/>
             </w:rPr>
-            <m:t>+</m:t>
-          </m:r>
-          <m:r>
-            <w:rPr>
-              <w:rFonts w:ascii="Cambria Math" w:eastAsiaTheme="minorEastAsia" w:hAnsi="Cambria Math"/>
-            </w:rPr>
-            <m:t>10n+5</m:t>
-          </m:r>
-          <m:r>
-            <w:rPr>
-              <w:rFonts w:ascii="Cambria Math" w:eastAsiaTheme="minorEastAsia" w:hAnsi="Cambria Math"/>
-            </w:rPr>
-            <m:t xml:space="preserve"> ≤</m:t>
-          </m:r>
-          <m:r>
-            <w:rPr>
-              <w:rFonts w:ascii="Cambria Math" w:eastAsiaTheme="minorEastAsia" w:hAnsi="Cambria Math"/>
-            </w:rPr>
-            <m:t>18</m:t>
-          </m:r>
-          <m:r>
-            <w:rPr>
-              <w:rFonts w:ascii="Cambria Math" w:eastAsiaTheme="minorEastAsia" w:hAnsi="Cambria Math"/>
-            </w:rPr>
-            <m:t>∙</m:t>
+            <m:t>+10n+5 ≤18∙</m:t>
           </m:r>
           <m:sSup>
             <m:sSupPr>
@@ -848,6 +787,9 @@
             </m:sup>
           </m:sSup>
           <m:r>
+            <m:rPr>
+              <m:sty m:val="p"/>
+            </m:rPr>
             <w:rPr>
               <w:rFonts w:ascii="Cambria Math" w:eastAsiaTheme="minorEastAsia" w:hAnsi="Cambria Math"/>
             </w:rPr>
@@ -869,6 +811,9 @@
           <m:t>n≥1</m:t>
         </m:r>
         <m:r>
+          <m:rPr>
+            <m:sty m:val="p"/>
+          </m:rPr>
           <w:rPr>
             <w:rFonts w:ascii="Cambria Math" w:eastAsiaTheme="minorEastAsia" w:hAnsi="Cambria Math"/>
           </w:rPr>
@@ -946,37 +891,7 @@
           <w:rPr>
             <w:rFonts w:ascii="Cambria Math" w:hAnsi="Cambria Math"/>
           </w:rPr>
-          <m:t>c=</m:t>
-        </m:r>
-        <m:r>
-          <w:rPr>
-            <w:rFonts w:ascii="Cambria Math" w:hAnsi="Cambria Math"/>
-          </w:rPr>
-          <m:t>2</m:t>
-        </m:r>
-        <m:r>
-          <w:rPr>
-            <w:rFonts w:ascii="Cambria Math" w:hAnsi="Cambria Math"/>
-          </w:rPr>
-          <m:t>+</m:t>
-        </m:r>
-        <m:r>
-          <w:rPr>
-            <w:rFonts w:ascii="Cambria Math" w:hAnsi="Cambria Math"/>
-          </w:rPr>
-          <m:t>100</m:t>
-        </m:r>
-        <m:r>
-          <w:rPr>
-            <w:rFonts w:ascii="Cambria Math" w:hAnsi="Cambria Math"/>
-          </w:rPr>
-          <m:t>=</m:t>
-        </m:r>
-        <m:r>
-          <w:rPr>
-            <w:rFonts w:ascii="Cambria Math" w:hAnsi="Cambria Math"/>
-          </w:rPr>
-          <m:t>102</m:t>
+          <m:t>c=2+100=102</m:t>
         </m:r>
       </m:oMath>
       <w:r>
@@ -1039,6 +954,9 @@
             </m:e>
           </m:d>
           <m:r>
+            <m:rPr>
+              <m:sty m:val="p"/>
+            </m:rPr>
             <w:rPr>
               <w:rFonts w:eastAsiaTheme="minorEastAsia"/>
             </w:rPr>
@@ -1050,37 +968,7 @@
             <w:rPr>
               <w:rFonts w:ascii="Cambria Math" w:eastAsiaTheme="minorEastAsia" w:hAnsi="Cambria Math"/>
             </w:rPr>
-            <m:t>2</m:t>
-          </m:r>
-          <m:r>
-            <w:rPr>
-              <w:rFonts w:ascii="Cambria Math" w:eastAsiaTheme="minorEastAsia" w:hAnsi="Cambria Math"/>
-            </w:rPr>
-            <m:t>n+</m:t>
-          </m:r>
-          <m:r>
-            <w:rPr>
-              <w:rFonts w:ascii="Cambria Math" w:eastAsiaTheme="minorEastAsia" w:hAnsi="Cambria Math"/>
-            </w:rPr>
-            <m:t>100</m:t>
-          </m:r>
-          <m:r>
-            <w:rPr>
-              <w:rFonts w:ascii="Cambria Math" w:eastAsiaTheme="minorEastAsia" w:hAnsi="Cambria Math"/>
-            </w:rPr>
-            <m:t xml:space="preserve"> ≤</m:t>
-          </m:r>
-          <m:r>
-            <w:rPr>
-              <w:rFonts w:ascii="Cambria Math" w:eastAsiaTheme="minorEastAsia" w:hAnsi="Cambria Math"/>
-            </w:rPr>
-            <m:t>102</m:t>
-          </m:r>
-          <m:r>
-            <w:rPr>
-              <w:rFonts w:ascii="Cambria Math" w:eastAsiaTheme="minorEastAsia" w:hAnsi="Cambria Math"/>
-            </w:rPr>
-            <m:t>∙</m:t>
+            <m:t>2n+100 ≤102∙</m:t>
           </m:r>
           <m:sSup>
             <m:sSupPr>
@@ -1109,6 +997,9 @@
             </m:sup>
           </m:sSup>
           <m:r>
+            <m:rPr>
+              <m:sty m:val="p"/>
+            </m:rPr>
             <w:rPr>
               <w:rFonts w:ascii="Cambria Math" w:eastAsiaTheme="minorEastAsia" w:hAnsi="Cambria Math"/>
             </w:rPr>
@@ -1130,6 +1021,9 @@
           <m:t>n≥1</m:t>
         </m:r>
         <m:r>
+          <m:rPr>
+            <m:sty m:val="p"/>
+          </m:rPr>
           <w:rPr>
             <w:rFonts w:ascii="Cambria Math" w:eastAsiaTheme="minorEastAsia" w:hAnsi="Cambria Math"/>
           </w:rPr>
@@ -1192,7 +1086,7 @@
     </w:p>
     <w:p>
       <w:pPr>
-        <w:pStyle w:val="berschrift2"/>
+        <w:pStyle w:val="berschrift1"/>
       </w:pPr>
       <w:r>
         <w:lastRenderedPageBreak/>
@@ -1289,13 +1183,7 @@
           <w:rPr>
             <w:rFonts w:ascii="Cambria Math" w:eastAsiaTheme="minorEastAsia" w:hAnsi="Cambria Math"/>
           </w:rPr>
-          <m:t>c⋅</m:t>
-        </m:r>
-        <m:r>
-          <w:rPr>
-            <w:rFonts w:ascii="Cambria Math" w:eastAsiaTheme="minorEastAsia" w:hAnsi="Cambria Math"/>
-          </w:rPr>
-          <m:t>g</m:t>
+          <m:t>c⋅g</m:t>
         </m:r>
         <m:d>
           <m:dPr>
@@ -1319,13 +1207,7 @@
           <w:rPr>
             <w:rFonts w:ascii="Cambria Math" w:eastAsiaTheme="minorEastAsia" w:hAnsi="Cambria Math"/>
           </w:rPr>
-          <m:t xml:space="preserve"> mit c</m:t>
-        </m:r>
-        <m:r>
-          <w:rPr>
-            <w:rFonts w:ascii="Cambria Math" w:eastAsiaTheme="minorEastAsia" w:hAnsi="Cambria Math"/>
-          </w:rPr>
-          <m:t>&gt;5</m:t>
+          <m:t xml:space="preserve"> mit c&gt;5</m:t>
         </m:r>
       </m:oMath>
       <w:r>
@@ -1353,13 +1235,7 @@
         <w:rPr>
           <w:rFonts w:eastAsiaTheme="minorEastAsia"/>
         </w:rPr>
-        <w:t xml:space="preserve"> </w:t>
-      </w:r>
-      <w:r>
-        <w:rPr>
-          <w:rFonts w:eastAsiaTheme="minorEastAsia"/>
-        </w:rPr>
-        <w:t xml:space="preserve"> wächst als </w:t>
+        <w:t xml:space="preserve">  wächst als </w:t>
       </w:r>
       <m:oMath>
         <m:r>
@@ -1416,13 +1292,7 @@
           <w:rPr>
             <w:rFonts w:ascii="Cambria Math" w:eastAsiaTheme="minorEastAsia" w:hAnsi="Cambria Math"/>
           </w:rPr>
-          <m:t>c</m:t>
-        </m:r>
-        <m:r>
-          <w:rPr>
-            <w:rFonts w:ascii="Cambria Math" w:eastAsiaTheme="minorEastAsia" w:hAnsi="Cambria Math"/>
-          </w:rPr>
-          <m:t>⋅g</m:t>
+          <m:t>c⋅g</m:t>
         </m:r>
         <m:d>
           <m:dPr>
@@ -1703,13 +1573,7 @@
           <w:rPr>
             <w:rFonts w:ascii="Cambria Math" w:eastAsiaTheme="minorEastAsia" w:hAnsi="Cambria Math"/>
           </w:rPr>
-          <m:t xml:space="preserve"> </m:t>
-        </m:r>
-        <m:r>
-          <w:rPr>
-            <w:rFonts w:ascii="Cambria Math" w:eastAsiaTheme="minorEastAsia" w:hAnsi="Cambria Math"/>
-          </w:rPr>
-          <m:t>n&lt;</m:t>
+          <m:t xml:space="preserve"> n&lt;</m:t>
         </m:r>
         <m:f>
           <m:fPr>
@@ -1767,13 +1631,7 @@
           <w:rPr>
             <w:rFonts w:ascii="Cambria Math" w:eastAsiaTheme="minorEastAsia" w:hAnsi="Cambria Math"/>
           </w:rPr>
-          <m:t>c</m:t>
-        </m:r>
-        <m:r>
-          <w:rPr>
-            <w:rFonts w:ascii="Cambria Math" w:eastAsiaTheme="minorEastAsia" w:hAnsi="Cambria Math"/>
-          </w:rPr>
-          <m:t>⋅g</m:t>
+          <m:t>c⋅g</m:t>
         </m:r>
         <m:d>
           <m:dPr>
@@ -1797,13 +1655,7 @@
           <w:rPr>
             <w:rFonts w:ascii="Cambria Math" w:eastAsiaTheme="minorEastAsia" w:hAnsi="Cambria Math"/>
           </w:rPr>
-          <m:t>&lt;</m:t>
-        </m:r>
-        <m:r>
-          <w:rPr>
-            <w:rFonts w:ascii="Cambria Math" w:eastAsiaTheme="minorEastAsia" w:hAnsi="Cambria Math"/>
-          </w:rPr>
-          <m:t>f(n)</m:t>
+          <m:t>&lt;f(n)</m:t>
         </m:r>
       </m:oMath>
       <w:r>
@@ -1858,19 +1710,7 @@
           <w:rPr>
             <w:rFonts w:ascii="Cambria Math" w:hAnsi="Cambria Math"/>
           </w:rPr>
-          <m:t>∈</m:t>
-        </m:r>
-        <m:r>
-          <w:rPr>
-            <w:rFonts w:ascii="Cambria Math" w:hAnsi="Cambria Math"/>
-          </w:rPr>
-          <m:t>Θ</m:t>
-        </m:r>
-        <m:r>
-          <w:rPr>
-            <w:rFonts w:ascii="Cambria Math" w:hAnsi="Cambria Math"/>
-          </w:rPr>
-          <m:t>(g</m:t>
+          <m:t>∈Θ(g</m:t>
         </m:r>
         <m:d>
           <m:dPr>
@@ -1980,19 +1820,7 @@
           <w:rPr>
             <w:rFonts w:ascii="Cambria Math" w:eastAsiaTheme="minorEastAsia" w:hAnsi="Cambria Math"/>
           </w:rPr>
-          <m:t>⋅</m:t>
-        </m:r>
-        <m:r>
-          <w:rPr>
-            <w:rFonts w:ascii="Cambria Math" w:eastAsiaTheme="minorEastAsia" w:hAnsi="Cambria Math"/>
-          </w:rPr>
-          <m:t>n</m:t>
-        </m:r>
-        <m:r>
-          <w:rPr>
-            <w:rFonts w:ascii="Cambria Math" w:eastAsiaTheme="minorEastAsia" w:hAnsi="Cambria Math"/>
-          </w:rPr>
-          <m:t>≤ld(n)≤</m:t>
+          <m:t>⋅n≤ld(n)≤</m:t>
         </m:r>
         <m:sSub>
           <m:sSubPr>
@@ -2109,11 +1937,6 @@
           <w:rFonts w:eastAsiaTheme="minorEastAsia"/>
         </w:rPr>
         <w:br/>
-      </w:r>
-      <w:r>
-        <w:rPr>
-          <w:rFonts w:eastAsiaTheme="minorEastAsia"/>
-        </w:rPr>
         <w:t>Es lassen sich</w:t>
       </w:r>
       <w:r>
@@ -2347,25 +2170,7 @@
           <w:rPr>
             <w:rFonts w:ascii="Cambria Math" w:eastAsiaTheme="minorEastAsia" w:hAnsi="Cambria Math"/>
           </w:rPr>
-          <m:t>c⋅</m:t>
-        </m:r>
-        <m:r>
-          <w:rPr>
-            <w:rFonts w:ascii="Cambria Math" w:eastAsiaTheme="minorEastAsia" w:hAnsi="Cambria Math"/>
-          </w:rPr>
-          <m:t>n</m:t>
-        </m:r>
-        <m:r>
-          <w:rPr>
-            <w:rFonts w:ascii="Cambria Math" w:eastAsiaTheme="minorEastAsia" w:hAnsi="Cambria Math"/>
-          </w:rPr>
-          <m:t>&lt;</m:t>
-        </m:r>
-        <m:r>
-          <w:rPr>
-            <w:rFonts w:ascii="Cambria Math" w:eastAsiaTheme="minorEastAsia" w:hAnsi="Cambria Math"/>
-          </w:rPr>
-          <m:t>ld(n)</m:t>
+          <m:t>c⋅n&lt;ld(n)</m:t>
         </m:r>
       </m:oMath>
       <w:r>
@@ -2411,13 +2216,7 @@
           <w:rPr>
             <w:rFonts w:ascii="Cambria Math" w:eastAsiaTheme="minorEastAsia" w:hAnsi="Cambria Math"/>
           </w:rPr>
-          <m:t>c∙</m:t>
-        </m:r>
-        <m:r>
-          <w:rPr>
-            <w:rFonts w:ascii="Cambria Math" w:eastAsiaTheme="minorEastAsia" w:hAnsi="Cambria Math"/>
-          </w:rPr>
-          <m:t>g</m:t>
+          <m:t>c∙g</m:t>
         </m:r>
         <m:d>
           <m:dPr>
@@ -2487,19 +2286,7 @@
           <w:rPr>
             <w:rFonts w:ascii="Cambria Math" w:eastAsiaTheme="minorEastAsia" w:hAnsi="Cambria Math"/>
           </w:rPr>
-          <m:t>c⋅n</m:t>
-        </m:r>
-        <m:r>
-          <w:rPr>
-            <w:rFonts w:ascii="Cambria Math" w:eastAsiaTheme="minorEastAsia" w:hAnsi="Cambria Math"/>
-          </w:rPr>
-          <m:t>&gt;</m:t>
-        </m:r>
-        <m:r>
-          <w:rPr>
-            <w:rFonts w:ascii="Cambria Math" w:eastAsiaTheme="minorEastAsia" w:hAnsi="Cambria Math"/>
-          </w:rPr>
-          <m:t>ld(n)</m:t>
+          <m:t>c⋅n&gt;ld(n)</m:t>
         </m:r>
       </m:oMath>
       <w:r>
@@ -2551,13 +2338,7 @@
           <w:rPr>
             <w:rFonts w:ascii="Cambria Math" w:eastAsiaTheme="minorEastAsia" w:hAnsi="Cambria Math"/>
           </w:rPr>
-          <m:t>c⋅</m:t>
-        </m:r>
-        <m:r>
-          <w:rPr>
-            <w:rFonts w:ascii="Cambria Math" w:eastAsiaTheme="minorEastAsia" w:hAnsi="Cambria Math"/>
-          </w:rPr>
-          <m:t>g</m:t>
+          <m:t>c⋅g</m:t>
         </m:r>
         <m:d>
           <m:dPr>
@@ -2586,13 +2367,126 @@
       </w:r>
     </w:p>
     <w:sectPr>
+      <w:headerReference w:type="default" r:id="rId8"/>
+      <w:footerReference w:type="default" r:id="rId9"/>
       <w:pgSz w:w="11906" w:h="16838"/>
-      <w:pgMar w:top="1417" w:right="1417" w:bottom="1134" w:left="1417" w:header="708" w:footer="708" w:gutter="0"/>
+      <w:pgMar w:top="1417" w:right="1417" w:bottom="1134" w:left="1417" w:header="567" w:footer="624" w:gutter="0"/>
       <w:cols w:space="708"/>
       <w:docGrid w:linePitch="360"/>
     </w:sectPr>
   </w:body>
 </w:document>
+</file>
+
+<file path=word/endnotes.xml><?xml version="1.0" encoding="utf-8"?>
+<w:endnotes xmlns:wpc="http://schemas.microsoft.com/office/word/2010/wordprocessingCanvas" xmlns:cx="http://schemas.microsoft.com/office/drawing/2014/chartex" xmlns:cx1="http://schemas.microsoft.com/office/drawing/2015/9/8/chartex" xmlns:cx2="http://schemas.microsoft.com/office/drawing/2015/10/21/chartex" xmlns:cx3="http://schemas.microsoft.com/office/drawing/2016/5/9/chartex" xmlns:cx4="http://schemas.microsoft.com/office/drawing/2016/5/10/chartex" xmlns:cx5="http://schemas.microsoft.com/office/drawing/2016/5/11/chartex" xmlns:cx6="http://schemas.microsoft.com/office/drawing/2016/5/12/chartex" xmlns:cx7="http://schemas.microsoft.com/office/drawing/2016/5/13/chartex" xmlns:cx8="http://schemas.microsoft.com/office/drawing/2016/5/14/chartex" xmlns:mc="http://schemas.openxmlformats.org/markup-compatibility/2006" xmlns:aink="http://schemas.microsoft.com/office/drawing/2016/ink" xmlns:am3d="http://schemas.microsoft.com/office/drawing/2017/model3d" xmlns:o="urn:schemas-microsoft-com:office:office" xmlns:oel="http://schemas.microsoft.com/office/2019/extlst" xmlns:r="http://schemas.openxmlformats.org/officeDocument/2006/relationships" xmlns:m="http://schemas.openxmlformats.org/officeDocument/2006/math" xmlns:v="urn:schemas-microsoft-com:vml" xmlns:wp14="http://schemas.microsoft.com/office/word/2010/wordprocessingDrawing" xmlns:wp="http://schemas.openxmlformats.org/drawingml/2006/wordprocessingDrawing" xmlns:w10="urn:schemas-microsoft-com:office:word" xmlns:w="http://schemas.openxmlformats.org/wordprocessingml/2006/main" xmlns:w14="http://schemas.microsoft.com/office/word/2010/wordml" xmlns:w15="http://schemas.microsoft.com/office/word/2012/wordml" xmlns:w16cex="http://schemas.microsoft.com/office/word/2018/wordml/cex" xmlns:w16cid="http://schemas.microsoft.com/office/word/2016/wordml/cid" xmlns:w16="http://schemas.microsoft.com/office/word/2018/wordml" xmlns:w16du="http://schemas.microsoft.com/office/word/2023/wordml/word16du" xmlns:w16sdtdh="http://schemas.microsoft.com/office/word/2020/wordml/sdtdatahash" xmlns:w16sdtfl="http://schemas.microsoft.com/office/word/2024/wordml/sdtformatlock" xmlns:w16se="http://schemas.microsoft.com/office/word/2015/wordml/symex" xmlns:wpg="http://schemas.microsoft.com/office/word/2010/wordprocessingGroup" xmlns:wpi="http://schemas.microsoft.com/office/word/2010/wordprocessingInk" xmlns:wne="http://schemas.microsoft.com/office/word/2006/wordml" xmlns:wps="http://schemas.microsoft.com/office/word/2010/wordprocessingShape" mc:Ignorable="w14 w15 w16se w16cid w16 w16cex w16sdtdh w16sdtfl w16du wp14">
+  <w:endnote w:type="separator" w:id="-1">
+    <w:p>
+      <w:pPr>
+        <w:spacing w:after="0" w:line="240" w:lineRule="auto"/>
+      </w:pPr>
+      <w:r>
+        <w:separator/>
+      </w:r>
+    </w:p>
+  </w:endnote>
+  <w:endnote w:type="continuationSeparator" w:id="0">
+    <w:p>
+      <w:pPr>
+        <w:spacing w:after="0" w:line="240" w:lineRule="auto"/>
+      </w:pPr>
+      <w:r>
+        <w:continuationSeparator/>
+      </w:r>
+    </w:p>
+  </w:endnote>
+</w:endnotes>
+</file>
+
+<file path=word/footer1.xml><?xml version="1.0" encoding="utf-8"?>
+<w:ftr xmlns:wpc="http://schemas.microsoft.com/office/word/2010/wordprocessingCanvas" xmlns:cx="http://schemas.microsoft.com/office/drawing/2014/chartex" xmlns:cx1="http://schemas.microsoft.com/office/drawing/2015/9/8/chartex" xmlns:cx2="http://schemas.microsoft.com/office/drawing/2015/10/21/chartex" xmlns:cx3="http://schemas.microsoft.com/office/drawing/2016/5/9/chartex" xmlns:cx4="http://schemas.microsoft.com/office/drawing/2016/5/10/chartex" xmlns:cx5="http://schemas.microsoft.com/office/drawing/2016/5/11/chartex" xmlns:cx6="http://schemas.microsoft.com/office/drawing/2016/5/12/chartex" xmlns:cx7="http://schemas.microsoft.com/office/drawing/2016/5/13/chartex" xmlns:cx8="http://schemas.microsoft.com/office/drawing/2016/5/14/chartex" xmlns:mc="http://schemas.openxmlformats.org/markup-compatibility/2006" xmlns:aink="http://schemas.microsoft.com/office/drawing/2016/ink" xmlns:am3d="http://schemas.microsoft.com/office/drawing/2017/model3d" xmlns:o="urn:schemas-microsoft-com:office:office" xmlns:oel="http://schemas.microsoft.com/office/2019/extlst" xmlns:r="http://schemas.openxmlformats.org/officeDocument/2006/relationships" xmlns:m="http://schemas.openxmlformats.org/officeDocument/2006/math" xmlns:v="urn:schemas-microsoft-com:vml" xmlns:wp14="http://schemas.microsoft.com/office/word/2010/wordprocessingDrawing" xmlns:wp="http://schemas.openxmlformats.org/drawingml/2006/wordprocessingDrawing" xmlns:w10="urn:schemas-microsoft-com:office:word" xmlns:w="http://schemas.openxmlformats.org/wordprocessingml/2006/main" xmlns:w14="http://schemas.microsoft.com/office/word/2010/wordml" xmlns:w15="http://schemas.microsoft.com/office/word/2012/wordml" xmlns:w16cex="http://schemas.microsoft.com/office/word/2018/wordml/cex" xmlns:w16cid="http://schemas.microsoft.com/office/word/2016/wordml/cid" xmlns:w16="http://schemas.microsoft.com/office/word/2018/wordml" xmlns:w16du="http://schemas.microsoft.com/office/word/2023/wordml/word16du" xmlns:w16sdtdh="http://schemas.microsoft.com/office/word/2020/wordml/sdtdatahash" xmlns:w16sdtfl="http://schemas.microsoft.com/office/word/2024/wordml/sdtformatlock" xmlns:w16se="http://schemas.microsoft.com/office/word/2015/wordml/symex" xmlns:wpg="http://schemas.microsoft.com/office/word/2010/wordprocessingGroup" xmlns:wpi="http://schemas.microsoft.com/office/word/2010/wordprocessingInk" xmlns:wne="http://schemas.microsoft.com/office/word/2006/wordml" xmlns:wps="http://schemas.microsoft.com/office/word/2010/wordprocessingShape" mc:Ignorable="w14 w15 w16se w16cid w16 w16cex w16sdtdh w16sdtfl w16du wp14">
+  <w:p>
+    <w:pPr>
+      <w:pStyle w:val="Fuzeile"/>
+    </w:pPr>
+    <w:r>
+      <w:tab/>
+      <w:t>13.04.2026</w:t>
+    </w:r>
+    <w:r>
+      <w:tab/>
+    </w:r>
+    <w:r>
+      <w:fldChar w:fldCharType="begin"/>
+    </w:r>
+    <w:r>
+      <w:instrText>PAGE   \* MERGEFORMAT</w:instrText>
+    </w:r>
+    <w:r>
+      <w:fldChar w:fldCharType="separate"/>
+    </w:r>
+    <w:r>
+      <w:t>1</w:t>
+    </w:r>
+    <w:r>
+      <w:fldChar w:fldCharType="end"/>
+    </w:r>
+  </w:p>
+</w:ftr>
+</file>
+
+<file path=word/footnotes.xml><?xml version="1.0" encoding="utf-8"?>
+<w:footnotes xmlns:wpc="http://schemas.microsoft.com/office/word/2010/wordprocessingCanvas" xmlns:cx="http://schemas.microsoft.com/office/drawing/2014/chartex" xmlns:cx1="http://schemas.microsoft.com/office/drawing/2015/9/8/chartex" xmlns:cx2="http://schemas.microsoft.com/office/drawing/2015/10/21/chartex" xmlns:cx3="http://schemas.microsoft.com/office/drawing/2016/5/9/chartex" xmlns:cx4="http://schemas.microsoft.com/office/drawing/2016/5/10/chartex" xmlns:cx5="http://schemas.microsoft.com/office/drawing/2016/5/11/chartex" xmlns:cx6="http://schemas.microsoft.com/office/drawing/2016/5/12/chartex" xmlns:cx7="http://schemas.microsoft.com/office/drawing/2016/5/13/chartex" xmlns:cx8="http://schemas.microsoft.com/office/drawing/2016/5/14/chartex" xmlns:mc="http://schemas.openxmlformats.org/markup-compatibility/2006" xmlns:aink="http://schemas.microsoft.com/office/drawing/2016/ink" xmlns:am3d="http://schemas.microsoft.com/office/drawing/2017/model3d" xmlns:o="urn:schemas-microsoft-com:office:office" xmlns:oel="http://schemas.microsoft.com/office/2019/extlst" xmlns:r="http://schemas.openxmlformats.org/officeDocument/2006/relationships" xmlns:m="http://schemas.openxmlformats.org/officeDocument/2006/math" xmlns:v="urn:schemas-microsoft-com:vml" xmlns:wp14="http://schemas.microsoft.com/office/word/2010/wordprocessingDrawing" xmlns:wp="http://schemas.openxmlformats.org/drawingml/2006/wordprocessingDrawing" xmlns:w10="urn:schemas-microsoft-com:office:word" xmlns:w="http://schemas.openxmlformats.org/wordprocessingml/2006/main" xmlns:w14="http://schemas.microsoft.com/office/word/2010/wordml" xmlns:w15="http://schemas.microsoft.com/office/word/2012/wordml" xmlns:w16cex="http://schemas.microsoft.com/office/word/2018/wordml/cex" xmlns:w16cid="http://schemas.microsoft.com/office/word/2016/wordml/cid" xmlns:w16="http://schemas.microsoft.com/office/word/2018/wordml" xmlns:w16du="http://schemas.microsoft.com/office/word/2023/wordml/word16du" xmlns:w16sdtdh="http://schemas.microsoft.com/office/word/2020/wordml/sdtdatahash" xmlns:w16sdtfl="http://schemas.microsoft.com/office/word/2024/wordml/sdtformatlock" xmlns:w16se="http://schemas.microsoft.com/office/word/2015/wordml/symex" xmlns:wpg="http://schemas.microsoft.com/office/word/2010/wordprocessingGroup" xmlns:wpi="http://schemas.microsoft.com/office/word/2010/wordprocessingInk" xmlns:wne="http://schemas.microsoft.com/office/word/2006/wordml" xmlns:wps="http://schemas.microsoft.com/office/word/2010/wordprocessingShape" mc:Ignorable="w14 w15 w16se w16cid w16 w16cex w16sdtdh w16sdtfl w16du wp14">
+  <w:footnote w:type="separator" w:id="-1">
+    <w:p>
+      <w:pPr>
+        <w:spacing w:after="0" w:line="240" w:lineRule="auto"/>
+      </w:pPr>
+      <w:r>
+        <w:separator/>
+      </w:r>
+    </w:p>
+  </w:footnote>
+  <w:footnote w:type="continuationSeparator" w:id="0">
+    <w:p>
+      <w:pPr>
+        <w:spacing w:after="0" w:line="240" w:lineRule="auto"/>
+      </w:pPr>
+      <w:r>
+        <w:continuationSeparator/>
+      </w:r>
+    </w:p>
+  </w:footnote>
+</w:footnotes>
+</file>
+
+<file path=word/header1.xml><?xml version="1.0" encoding="utf-8"?>
+<w:hdr xmlns:wpc="http://schemas.microsoft.com/office/word/2010/wordprocessingCanvas" xmlns:cx="http://schemas.microsoft.com/office/drawing/2014/chartex" xmlns:cx1="http://schemas.microsoft.com/office/drawing/2015/9/8/chartex" xmlns:cx2="http://schemas.microsoft.com/office/drawing/2015/10/21/chartex" xmlns:cx3="http://schemas.microsoft.com/office/drawing/2016/5/9/chartex" xmlns:cx4="http://schemas.microsoft.com/office/drawing/2016/5/10/chartex" xmlns:cx5="http://schemas.microsoft.com/office/drawing/2016/5/11/chartex" xmlns:cx6="http://schemas.microsoft.com/office/drawing/2016/5/12/chartex" xmlns:cx7="http://schemas.microsoft.com/office/drawing/2016/5/13/chartex" xmlns:cx8="http://schemas.microsoft.com/office/drawing/2016/5/14/chartex" xmlns:mc="http://schemas.openxmlformats.org/markup-compatibility/2006" xmlns:aink="http://schemas.microsoft.com/office/drawing/2016/ink" xmlns:am3d="http://schemas.microsoft.com/office/drawing/2017/model3d" xmlns:o="urn:schemas-microsoft-com:office:office" xmlns:oel="http://schemas.microsoft.com/office/2019/extlst" xmlns:r="http://schemas.openxmlformats.org/officeDocument/2006/relationships" xmlns:m="http://schemas.openxmlformats.org/officeDocument/2006/math" xmlns:v="urn:schemas-microsoft-com:vml" xmlns:wp14="http://schemas.microsoft.com/office/word/2010/wordprocessingDrawing" xmlns:wp="http://schemas.openxmlformats.org/drawingml/2006/wordprocessingDrawing" xmlns:w10="urn:schemas-microsoft-com:office:word" xmlns:w="http://schemas.openxmlformats.org/wordprocessingml/2006/main" xmlns:w14="http://schemas.microsoft.com/office/word/2010/wordml" xmlns:w15="http://schemas.microsoft.com/office/word/2012/wordml" xmlns:w16cex="http://schemas.microsoft.com/office/word/2018/wordml/cex" xmlns:w16cid="http://schemas.microsoft.com/office/word/2016/wordml/cid" xmlns:w16="http://schemas.microsoft.com/office/word/2018/wordml" xmlns:w16du="http://schemas.microsoft.com/office/word/2023/wordml/word16du" xmlns:w16sdtdh="http://schemas.microsoft.com/office/word/2020/wordml/sdtdatahash" xmlns:w16sdtfl="http://schemas.microsoft.com/office/word/2024/wordml/sdtformatlock" xmlns:w16se="http://schemas.microsoft.com/office/word/2015/wordml/symex" xmlns:wpg="http://schemas.microsoft.com/office/word/2010/wordprocessingGroup" xmlns:wpi="http://schemas.microsoft.com/office/word/2010/wordprocessingInk" xmlns:wne="http://schemas.microsoft.com/office/word/2006/wordml" xmlns:wps="http://schemas.microsoft.com/office/word/2010/wordprocessingShape" mc:Ignorable="w14 w15 w16se w16cid w16 w16cex w16sdtdh w16sdtfl w16du wp14">
+  <w:p>
+    <w:pPr>
+      <w:pStyle w:val="Kopfzeile"/>
+    </w:pPr>
+    <w:r>
+      <w:t>Praktikumsbericht mINF4/1</w:t>
+    </w:r>
+    <w:r>
+      <w:tab/>
+      <w:t>Versuch 1</w:t>
+    </w:r>
+    <w:r>
+      <w:tab/>
+      <w:t>Sommer 2026</w:t>
+    </w:r>
+  </w:p>
+  <w:p>
+    <w:pPr>
+      <w:pStyle w:val="Kopfzeile"/>
+    </w:pPr>
+    <w:r>
+      <w:tab/>
+    </w:r>
+  </w:p>
+</w:hdr>
 </file>
 
 <file path=word/numbering.xml><?xml version="1.0" encoding="utf-8"?>
@@ -3801,6 +3695,50 @@
       <w:color w:val="666666"/>
     </w:rPr>
   </w:style>
+  <w:style w:type="paragraph" w:styleId="Kopfzeile">
+    <w:name w:val="header"/>
+    <w:basedOn w:val="Standard"/>
+    <w:link w:val="KopfzeileZchn"/>
+    <w:uiPriority w:val="99"/>
+    <w:unhideWhenUsed/>
+    <w:rsid w:val="00EC23DE"/>
+    <w:pPr>
+      <w:tabs>
+        <w:tab w:val="center" w:pos="4536"/>
+        <w:tab w:val="right" w:pos="9072"/>
+      </w:tabs>
+      <w:spacing w:after="0" w:line="240" w:lineRule="auto"/>
+    </w:pPr>
+  </w:style>
+  <w:style w:type="character" w:customStyle="1" w:styleId="KopfzeileZchn">
+    <w:name w:val="Kopfzeile Zchn"/>
+    <w:basedOn w:val="Absatz-Standardschriftart"/>
+    <w:link w:val="Kopfzeile"/>
+    <w:uiPriority w:val="99"/>
+    <w:rsid w:val="00EC23DE"/>
+  </w:style>
+  <w:style w:type="paragraph" w:styleId="Fuzeile">
+    <w:name w:val="footer"/>
+    <w:basedOn w:val="Standard"/>
+    <w:link w:val="FuzeileZchn"/>
+    <w:uiPriority w:val="99"/>
+    <w:unhideWhenUsed/>
+    <w:rsid w:val="00EC23DE"/>
+    <w:pPr>
+      <w:tabs>
+        <w:tab w:val="center" w:pos="4536"/>
+        <w:tab w:val="right" w:pos="9072"/>
+      </w:tabs>
+      <w:spacing w:after="0" w:line="240" w:lineRule="auto"/>
+    </w:pPr>
+  </w:style>
+  <w:style w:type="character" w:customStyle="1" w:styleId="FuzeileZchn">
+    <w:name w:val="Fußzeile Zchn"/>
+    <w:basedOn w:val="Absatz-Standardschriftart"/>
+    <w:link w:val="Fuzeile"/>
+    <w:uiPriority w:val="99"/>
+    <w:rsid w:val="00EC23DE"/>
+  </w:style>
 </w:styles>
 </file>
 

</xml_diff>